<commit_message>
docs: add GitHub repository and version control details
</commit_message>
<xml_diff>
--- a/HACK_ARENA_Technical_Report.docx
+++ b/HACK_ARENA_Technical_Report.docx
@@ -1492,6 +1492,39 @@
     <w:p>
       <w:r>
         <w:t xml:space="preserve">This architecture provides a strong foundation for extending the prototype into a larger recommendation platform while remaining appropriately lightweight for a timed hackathon.</w:t>
+      </w:r>
+    </w:p>
+    <w:p/>
+    <w:p>
+      <w:pPr>
+        <w:pStyle w:val="Heading1"/>
+      </w:pPr>
+      <w:r>
+        <w:t>25. GitHub Repository &amp; Version Control</w:t>
+      </w:r>
+    </w:p>
+    <w:p/>
+    <w:p>
+      <w:r>
+        <w:t xml:space="preserve">The completed project was committed to Git version control and pushed to the official GitHub repository: https://github.com/Srinesh-art/hackarena.git</w:t>
+      </w:r>
+    </w:p>
+    <w:p/>
+    <w:p>
+      <w:r>
+        <w:t xml:space="preserve">The repository contains the Docker Compose configuration, Trainer, API, Evaluator, preprocessing outputs, model artifacts, evaluation results, README, REPORT.md, and the presentation-ready Word report. It provides a reproducible source-control snapshot of the implemented hackathon system.</w:t>
+      </w:r>
+    </w:p>
+    <w:p/>
+    <w:p>
+      <w:r>
+        <w:t xml:space="preserve">Initial project commit: b3a29fa — feat: containerized OTT audience segmentation system</w:t>
+      </w:r>
+    </w:p>
+    <w:p/>
+    <w:p>
+      <w:r>
+        <w:t xml:space="preserve">Repository: Srinesh-art/hackarena | Default branch: main</w:t>
       </w:r>
     </w:p>
     <w:p/>

</xml_diff>